<commit_message>
Synopsis v3: dates 450-462, historical backdrop and contemporaries (Shushanik, Varsken, Peter the Iberian, Hun veteran)
Co-Authored-By: Claude Opus 5.5 <noreply@anthropic.com>
Claude-Session: https://claude.ai/code/session_01TUhCpmyEuwXm7rGtZgfP6r
</commit_message>
<xml_diff>
--- a/exports/08-sinopsis.docx
+++ b/exports/08-sinopsis.docx
@@ -2,13 +2,13 @@
 <file path=word/document.xml><?xml version="1.0" encoding="utf-8"?>
 <w:document xmlns:w="http://schemas.openxmlformats.org/wordprocessingml/2006/main" xmlns:m="http://schemas.openxmlformats.org/officeDocument/2006/math" xmlns:r="http://schemas.openxmlformats.org/officeDocument/2006/relationships" xmlns:o="urn:schemas-microsoft-com:office:office" xmlns:v="urn:schemas-microsoft-com:vml" xmlns:w10="urn:schemas-microsoft-com:office:word" xmlns:a="http://schemas.openxmlformats.org/drawingml/2006/main" xmlns:pic="http://schemas.openxmlformats.org/drawingml/2006/picture" xmlns:wp="http://schemas.openxmlformats.org/drawingml/2006/wordprocessingDrawing">
   <w:body>
-    <w:bookmarkStart w:id="29" w:name="Xecc31759555c06bf81417a8e4c013635fdb25d2"/>
+    <w:bookmarkStart w:id="29" w:name="горгасали.-волчья-голова-синопсис-v3"/>
     <w:p>
       <w:pPr>
         <w:pStyle w:val="Heading1"/>
       </w:pPr>
       <w:r>
-        <w:t xml:space="preserve">Горгасали. Волчья голова — синопсис (v2: волчий дар)</w:t>
+        <w:t xml:space="preserve">Горгасали. Волчья голова — синопсис (v3)</w:t>
       </w:r>
     </w:p>
     <w:p>
@@ -42,7 +42,20 @@
         <w:t xml:space="preserve"> </w:t>
       </w:r>
       <w:r>
-        <w:t xml:space="preserve">Картли, V век, грузинская мифология.</w:t>
+        <w:t xml:space="preserve">Картли (Восточная Грузия),</w:t>
+      </w:r>
+      <w:r>
+        <w:t xml:space="preserve"> </w:t>
+      </w:r>
+      <w:r>
+        <w:rPr>
+          <w:bCs/>
+          <w:b/>
+        </w:rPr>
+        <w:t xml:space="preserve">около 450–462 годов</w:t>
+      </w:r>
+      <w:r>
+        <w:t xml:space="preserve">, грузинская мифология.</w:t>
       </w:r>
       <w:r>
         <w:t xml:space="preserve"> </w:t>
@@ -88,70 +101,159 @@
           <w:bCs/>
           <w:b/>
         </w:rPr>
-        <w:t xml:space="preserve">Что изменилось по сравнению с v1.</w:t>
-      </w:r>
-      <w:r>
-        <w:t xml:space="preserve"> </w:t>
-      </w:r>
-      <w:r>
-        <w:t xml:space="preserve">- Волки больше не «псы Гмерти»: «гмерти» по-грузински просто «бог». Теперь это</w:t>
-      </w:r>
-      <w:r>
-        <w:t xml:space="preserve"> </w:t>
-      </w:r>
-      <w:r>
-        <w:rPr>
-          <w:bCs/>
-          <w:b/>
-        </w:rPr>
-        <w:t xml:space="preserve">стая Белого Георгия</w:t>
-      </w:r>
-      <w:r>
-        <w:t xml:space="preserve"> </w:t>
-      </w:r>
-      <w:r>
-        <w:t xml:space="preserve">(Тетри Гиорги).</w:t>
-      </w:r>
-      <w:r>
-        <w:t xml:space="preserve"> </w:t>
-      </w:r>
-      <w:r>
-        <w:t xml:space="preserve">- После набега мальчик</w:t>
-      </w:r>
-      <w:r>
-        <w:t xml:space="preserve"> </w:t>
-      </w:r>
-      <w:r>
-        <w:rPr>
-          <w:bCs/>
-          <w:b/>
-        </w:rPr>
-        <w:t xml:space="preserve">бежит в горы</w:t>
-      </w:r>
-      <w:r>
-        <w:t xml:space="preserve"> </w:t>
-      </w:r>
-      <w:r>
-        <w:t xml:space="preserve">и зиму живёт со стаей.</w:t>
-      </w:r>
-      <w:r>
-        <w:t xml:space="preserve"> </w:t>
-      </w:r>
-      <w:r>
-        <w:t xml:space="preserve">- У Вахтанга появляется</w:t>
-      </w:r>
-      <w:r>
-        <w:t xml:space="preserve"> </w:t>
-      </w:r>
-      <w:r>
-        <w:rPr>
-          <w:bCs/>
-          <w:b/>
-        </w:rPr>
-        <w:t xml:space="preserve">волчий дар</w:t>
-      </w:r>
-      <w:r>
-        <w:t xml:space="preserve">: кровь, стая, вой, превращение. Подробно в конце документа.</w:t>
+        <w:t xml:space="preserve">Что нового в v3</w:t>
+      </w:r>
+    </w:p>
+    <w:p>
+      <w:pPr>
+        <w:numPr>
+          <w:ilvl w:val="0"/>
+          <w:numId w:val="1001"/>
+        </w:numPr>
+        <w:pStyle w:val="Compact"/>
+      </w:pPr>
+      <w:r>
+        <w:rPr>
+          <w:bCs/>
+          <w:b/>
+        </w:rPr>
+        <w:t xml:space="preserve">Даты.</w:t>
+      </w:r>
+      <w:r>
+        <w:t xml:space="preserve"> </w:t>
+      </w:r>
+      <w:r>
+        <w:t xml:space="preserve">Действие идёт примерно с 450 по 462 год.</w:t>
+      </w:r>
+    </w:p>
+    <w:p>
+      <w:pPr>
+        <w:numPr>
+          <w:ilvl w:val="0"/>
+          <w:numId w:val="1001"/>
+        </w:numPr>
+        <w:pStyle w:val="Compact"/>
+      </w:pPr>
+      <w:r>
+        <w:rPr>
+          <w:bCs/>
+          <w:b/>
+        </w:rPr>
+        <w:t xml:space="preserve">Исторический фон.</w:t>
+      </w:r>
+      <w:r>
+        <w:t xml:space="preserve"> </w:t>
+      </w:r>
+      <w:r>
+        <w:t xml:space="preserve">Персия давит на христиан и в 451 году подавляет армянское восстание при Аваире. Держава Аттилы рушится после его смерти в 453 году, и её осколки бродят у Кавказа. Около 456 года Византия воюет за Лазику.</w:t>
+      </w:r>
+    </w:p>
+    <w:p>
+      <w:pPr>
+        <w:numPr>
+          <w:ilvl w:val="0"/>
+          <w:numId w:val="1001"/>
+        </w:numPr>
+        <w:pStyle w:val="Compact"/>
+      </w:pPr>
+      <w:r>
+        <w:rPr>
+          <w:bCs/>
+          <w:b/>
+        </w:rPr>
+        <w:t xml:space="preserve">Реальные современники в сюжете:</w:t>
+      </w:r>
+    </w:p>
+    <w:p>
+      <w:pPr>
+        <w:numPr>
+          <w:ilvl w:val="1"/>
+          <w:numId w:val="1002"/>
+        </w:numPr>
+        <w:pStyle w:val="Compact"/>
+      </w:pPr>
+      <w:r>
+        <w:rPr>
+          <w:bCs/>
+          <w:b/>
+        </w:rPr>
+        <w:t xml:space="preserve">Шушаник</w:t>
+      </w:r>
+      <w:r>
+        <w:t xml:space="preserve">, дочь героя Аваира;</w:t>
+      </w:r>
+    </w:p>
+    <w:p>
+      <w:pPr>
+        <w:numPr>
+          <w:ilvl w:val="1"/>
+          <w:numId w:val="1002"/>
+        </w:numPr>
+        <w:pStyle w:val="Compact"/>
+      </w:pPr>
+      <w:r>
+        <w:rPr>
+          <w:bCs/>
+          <w:b/>
+        </w:rPr>
+        <w:t xml:space="preserve">Варскен</w:t>
+      </w:r>
+      <w:r>
+        <w:t xml:space="preserve">, будущий отступник;</w:t>
+      </w:r>
+    </w:p>
+    <w:p>
+      <w:pPr>
+        <w:numPr>
+          <w:ilvl w:val="1"/>
+          <w:numId w:val="1002"/>
+        </w:numPr>
+        <w:pStyle w:val="Compact"/>
+      </w:pPr>
+      <w:r>
+        <w:rPr>
+          <w:bCs/>
+          <w:b/>
+        </w:rPr>
+        <w:t xml:space="preserve">Петр Ивер</w:t>
+      </w:r>
+      <w:r>
+        <w:t xml:space="preserve">, царевич-монах из того же царского дома;</w:t>
+      </w:r>
+    </w:p>
+    <w:p>
+      <w:pPr>
+        <w:numPr>
+          <w:ilvl w:val="1"/>
+          <w:numId w:val="1002"/>
+        </w:numPr>
+        <w:pStyle w:val="Compact"/>
+      </w:pPr>
+      <w:r>
+        <w:rPr>
+          <w:bCs/>
+          <w:b/>
+        </w:rPr>
+        <w:t xml:space="preserve">старый гунн</w:t>
+      </w:r>
+      <w:r>
+        <w:t xml:space="preserve">, который видел Аттилу.</w:t>
+      </w:r>
+    </w:p>
+    <w:p>
+      <w:pPr>
+        <w:pStyle w:val="BlockText"/>
+      </w:pPr>
+      <w:r>
+        <w:t xml:space="preserve">Из v2 остались волки Белого Георгия и волчий дар.</w:t>
+      </w:r>
+    </w:p>
+    <w:p>
+      <w:pPr>
+        <w:pStyle w:val="BlockText"/>
+      </w:pPr>
+      <w:r>
+        <w:t xml:space="preserve">📜 — по хронике Джуаншера или по истории. ✦ — грузинская мифология. ✳️ — наше допущение.</w:t>
       </w:r>
     </w:p>
     <w:p>
@@ -161,13 +263,13 @@
         </w:pict>
       </w:r>
     </w:p>
-    <w:bookmarkStart w:id="20" w:name="откуда-волки-белый-георгий"/>
+    <w:bookmarkStart w:id="20" w:name="мир-в-450-году"/>
     <w:p>
       <w:pPr>
         <w:pStyle w:val="Heading2"/>
       </w:pPr>
       <w:r>
-        <w:t xml:space="preserve">Откуда волки: Белый Георгий</w:t>
+        <w:t xml:space="preserve">Мир в 450 году</w:t>
       </w:r>
     </w:p>
     <w:p>
@@ -175,7 +277,137 @@
         <w:pStyle w:val="FirstParagraph"/>
       </w:pPr>
       <w:r>
-        <w:t xml:space="preserve">Для церкви Георгий — святой-воин. Для горцев Пшави и Хевсурети</w:t>
+        <w:t xml:space="preserve">Картли — маленькое христианское царство между двумя великанами:</w:t>
+      </w:r>
+      <w:r>
+        <w:t xml:space="preserve"> </w:t>
+      </w:r>
+      <w:r>
+        <w:rPr>
+          <w:bCs/>
+          <w:b/>
+        </w:rPr>
+        <w:t xml:space="preserve">Сасанидской Персией</w:t>
+      </w:r>
+      <w:r>
+        <w:t xml:space="preserve"> </w:t>
+      </w:r>
+      <w:r>
+        <w:t xml:space="preserve">и</w:t>
+      </w:r>
+      <w:r>
+        <w:t xml:space="preserve"> </w:t>
+      </w:r>
+      <w:r>
+        <w:rPr>
+          <w:bCs/>
+          <w:b/>
+        </w:rPr>
+        <w:t xml:space="preserve">Византией</w:t>
+      </w:r>
+      <w:r>
+        <w:t xml:space="preserve">.</w:t>
+      </w:r>
+    </w:p>
+    <w:p>
+      <w:pPr>
+        <w:numPr>
+          <w:ilvl w:val="0"/>
+          <w:numId w:val="1003"/>
+        </w:numPr>
+        <w:pStyle w:val="Compact"/>
+      </w:pPr>
+      <w:r>
+        <w:t xml:space="preserve">Шах</w:t>
+      </w:r>
+      <w:r>
+        <w:t xml:space="preserve"> </w:t>
+      </w:r>
+      <w:r>
+        <w:rPr>
+          <w:bCs/>
+          <w:b/>
+        </w:rPr>
+        <w:t xml:space="preserve">Йездигерд II</w:t>
+      </w:r>
+      <w:r>
+        <w:t xml:space="preserve"> </w:t>
+      </w:r>
+      <w:r>
+        <w:t xml:space="preserve">заставляет кавказских христиан вернуться к вере огня 📜.</w:t>
+      </w:r>
+    </w:p>
+    <w:p>
+      <w:pPr>
+        <w:numPr>
+          <w:ilvl w:val="0"/>
+          <w:numId w:val="1003"/>
+        </w:numPr>
+        <w:pStyle w:val="Compact"/>
+      </w:pPr>
+      <w:r>
+        <w:t xml:space="preserve">В Мцхете правит его человек, маг</w:t>
+      </w:r>
+      <w:r>
+        <w:t xml:space="preserve"> </w:t>
+      </w:r>
+      <w:r>
+        <w:rPr>
+          <w:bCs/>
+          <w:b/>
+        </w:rPr>
+        <w:t xml:space="preserve">Бинкаран</w:t>
+      </w:r>
+      <w:r>
+        <w:t xml:space="preserve"> </w:t>
+      </w:r>
+      <w:r>
+        <w:t xml:space="preserve">📜, а народ уходит в огнепоклонство.</w:t>
+      </w:r>
+    </w:p>
+    <w:p>
+      <w:pPr>
+        <w:numPr>
+          <w:ilvl w:val="0"/>
+          <w:numId w:val="1003"/>
+        </w:numPr>
+        <w:pStyle w:val="Compact"/>
+      </w:pPr>
+      <w:r>
+        <w:t xml:space="preserve">На западе Византия тянет к себе Лазику (бывшую Колхиду) 📜.</w:t>
+      </w:r>
+    </w:p>
+    <w:p>
+      <w:pPr>
+        <w:numPr>
+          <w:ilvl w:val="0"/>
+          <w:numId w:val="1003"/>
+        </w:numPr>
+        <w:pStyle w:val="Compact"/>
+      </w:pPr>
+      <w:r>
+        <w:t xml:space="preserve">На севере, за Дарьялом, кончается мир людей. Там лежит степь алан и гуннов. В нашей вселенной там же лежит и</w:t>
+      </w:r>
+      <w:r>
+        <w:t xml:space="preserve"> </w:t>
+      </w:r>
+      <w:r>
+        <w:rPr>
+          <w:bCs/>
+          <w:b/>
+        </w:rPr>
+        <w:t xml:space="preserve">квесквнели</w:t>
+      </w:r>
+      <w:r>
+        <w:t xml:space="preserve">, нижний мир, где живут невидимые деви ✦.</w:t>
+      </w:r>
+    </w:p>
+    <w:p>
+      <w:pPr>
+        <w:pStyle w:val="FirstParagraph"/>
+      </w:pPr>
+      <w:r>
+        <w:t xml:space="preserve">Креста в Картли уже больше ста лет. Но в горах Пшави и Хевсурети люди по-прежнему молятся детям бога, хвтисшвилеби. Среди них</w:t>
       </w:r>
       <w:r>
         <w:t xml:space="preserve"> </w:t>
@@ -188,111 +420,7 @@
         <w:t xml:space="preserve">Тетри Гиорги, Белый Георгий</w:t>
       </w:r>
       <w:r>
-        <w:t xml:space="preserve">, — один из хвтисшвилеби, детей бога, воитель с собственными святилищами, землями и дружиной ✦. Это тот же «закон двух слоёв»: один и тот же образ, увиденный двумя верами.</w:t>
-      </w:r>
-    </w:p>
-    <w:p>
-      <w:pPr>
-        <w:pStyle w:val="BodyText"/>
-      </w:pPr>
-      <w:r>
-        <w:t xml:space="preserve">Наше допущение ✳️:</w:t>
-      </w:r>
-      <w:r>
-        <w:t xml:space="preserve"> </w:t>
-      </w:r>
-      <w:r>
-        <w:rPr>
-          <w:bCs/>
-          <w:b/>
-        </w:rPr>
-        <w:t xml:space="preserve">волки — псы Белого Георгия.</w:t>
-      </w:r>
-      <w:r>
-        <w:t xml:space="preserve"> </w:t>
-      </w:r>
-      <w:r>
-        <w:t xml:space="preserve">Он спускает их на тех, кто нарушил клятву, и посылает к тем, кого выбрал.</w:t>
-      </w:r>
-    </w:p>
-    <w:p>
-      <w:pPr>
-        <w:numPr>
-          <w:ilvl w:val="0"/>
-          <w:numId w:val="1001"/>
-        </w:numPr>
-        <w:pStyle w:val="Compact"/>
-      </w:pPr>
-      <w:r>
-        <w:t xml:space="preserve">По всему Кавказу и Восточной Европе Святой Георгий известен как</w:t>
-      </w:r>
-      <w:r>
-        <w:t xml:space="preserve"> </w:t>
-      </w:r>
-      <w:r>
-        <w:rPr>
-          <w:bCs/>
-          <w:b/>
-        </w:rPr>
-        <w:t xml:space="preserve">хозяин волков</w:t>
-      </w:r>
-      <w:r>
-        <w:t xml:space="preserve">. Он кормит их, указывает, кого задрать, и «замыкает им пасти», чтобы не трогали скот.</w:t>
-      </w:r>
-    </w:p>
-    <w:p>
-      <w:pPr>
-        <w:numPr>
-          <w:ilvl w:val="0"/>
-          <w:numId w:val="1001"/>
-        </w:numPr>
-        <w:pStyle w:val="Compact"/>
-      </w:pPr>
-      <w:r>
-        <w:t xml:space="preserve">У соседей-алан властелина волков зовут</w:t>
-      </w:r>
-      <w:r>
-        <w:t xml:space="preserve"> </w:t>
-      </w:r>
-      <w:r>
-        <w:rPr>
-          <w:bCs/>
-          <w:b/>
-        </w:rPr>
-        <w:t xml:space="preserve">Тутыр</w:t>
-      </w:r>
-      <w:r>
-        <w:t xml:space="preserve">.</w:t>
-      </w:r>
-    </w:p>
-    <w:p>
-      <w:pPr>
-        <w:numPr>
-          <w:ilvl w:val="0"/>
-          <w:numId w:val="1001"/>
-        </w:numPr>
-        <w:pStyle w:val="Compact"/>
-      </w:pPr>
-      <w:r>
-        <w:t xml:space="preserve">Поэтому опора на традицию есть, но грузинские записи именно про «псов Георгия» нужно найти отдельно (см. источники в конце).</w:t>
-      </w:r>
-    </w:p>
-    <w:p>
-      <w:pPr>
-        <w:pStyle w:val="FirstParagraph"/>
-      </w:pPr>
-      <w:r>
-        <w:rPr>
-          <w:bCs/>
-          <w:b/>
-        </w:rPr>
-        <w:t xml:space="preserve">Приятная деталь:</w:t>
-      </w:r>
-      <w:r>
-        <w:t xml:space="preserve"> </w:t>
-      </w:r>
-      <w:r>
-        <w:t xml:space="preserve">у алан свой хозяин волков, и Бакатар узнает этот знак раньше, чем грузинские епископы.</w:t>
+        <w:t xml:space="preserve">, для церкви — святой, для горцев — воитель. По нашему допущению ✳️ ему служат волки: он посылает их к тем, кого выбрал.</w:t>
       </w:r>
     </w:p>
     <w:p>
@@ -303,13 +431,13 @@
       </w:r>
     </w:p>
     <w:bookmarkEnd w:id="20"/>
-    <w:bookmarkStart w:id="21" w:name="пролог.-каспи-10-лет"/>
+    <w:bookmarkStart w:id="21" w:name="пролог.-каспи-450-вахтангу-10-лет"/>
     <w:p>
       <w:pPr>
         <w:pStyle w:val="Heading2"/>
       </w:pPr>
       <w:r>
-        <w:t xml:space="preserve">Пролог. Каспи (10 лет)</w:t>
+        <w:t xml:space="preserve">Пролог. Каспи (~450, Вахтангу 10 лет)</w:t>
       </w:r>
     </w:p>
     <w:p>
@@ -317,7 +445,7 @@
         <w:pStyle w:val="FirstParagraph"/>
       </w:pPr>
       <w:r>
-        <w:t xml:space="preserve">Закат над горами Картли. Беркут летит над колонной алан к Каспи. В дыму факелов идёт рогатая тень, которую не видит никто из всадников.</w:t>
+        <w:t xml:space="preserve">Закат над горами. Беркут летит над колонной алан к Каспи. Среди всадников есть гунны с вытянутыми черепами, а в дыму факелов идёт рогатая тень, которую никто из них не видит.</w:t>
       </w:r>
     </w:p>
     <w:p>
@@ -325,17 +453,17 @@
         <w:pStyle w:val="BodyText"/>
       </w:pPr>
       <w:r>
-        <w:t xml:space="preserve">Ночью город горит. Десятилетний царь Вахтанг прячется под повозкой и видит, как великан Бакатар увозит его трёхлетнюю сестру Мирандухт. Крестик девочки падает в грязь. Кормилица вдавливает мальчика обратно в тень. У него с рождения янтарный клин в левом глазу. Кормилица шёпотом называет его «волчьим глазом»: «Тебя видят».</w:t>
+        <w:t xml:space="preserve">Ночью город горит. Вахтанг прячется под повозкой и видит, как великан Бакатар увозит его трёхлетнюю сестру Мирандухт 📜. Крестик девочки падает в грязь. Кормилица вдавливает мальчика обратно в тень и шепчет про янтарный клин в его глазу: «Волчий глаз. Тебя видят».</w:t>
       </w:r>
     </w:p>
     <w:bookmarkEnd w:id="21"/>
-    <w:bookmarkStart w:id="22" w:name="бегство-в-горы"/>
+    <w:bookmarkStart w:id="22" w:name="бегство-в-горы-зима-450451"/>
     <w:p>
       <w:pPr>
         <w:pStyle w:val="Heading2"/>
       </w:pPr>
       <w:r>
-        <w:t xml:space="preserve">Бегство в горы</w:t>
+        <w:t xml:space="preserve">Бегство в горы (зима 450–451)</w:t>
       </w:r>
     </w:p>
     <w:p>
@@ -343,20 +471,7 @@
         <w:pStyle w:val="FirstParagraph"/>
       </w:pPr>
       <w:r>
-        <w:t xml:space="preserve">На рассвете мальчик подбирает крестик и</w:t>
-      </w:r>
-      <w:r>
-        <w:t xml:space="preserve"> </w:t>
-      </w:r>
-      <w:r>
-        <w:rPr>
-          <w:bCs/>
-          <w:b/>
-        </w:rPr>
-        <w:t xml:space="preserve">убегает из Каспи один</w:t>
-      </w:r>
-      <w:r>
-        <w:t xml:space="preserve">, по следу конницы на север, вверх по Арагви. Он думает, что догонит.</w:t>
+        <w:t xml:space="preserve">На рассвете мальчик подбирает крестик и один бежит за конницей вверх по Арагви. На Гиоргобу ложится первый снег, и он замерзает в расщелине.</w:t>
       </w:r>
     </w:p>
     <w:p>
@@ -364,7 +479,7 @@
         <w:pStyle w:val="BodyText"/>
       </w:pPr>
       <w:r>
-        <w:t xml:space="preserve">Через неделю он в горах. Ложится первый снег, наступает Гиоргоба, зимний день Георгия. Мальчик замерзает в расщелине, и его находит стая.</w:t>
+        <w:t xml:space="preserve">Его находит стая. Ведёт её старая белая волчица с аланской стрелой в боку. Умирая, она отдаёт мальчику свою кровь, и вместе с кровью в него уходит она сама. Всю зиму Вахтанг живёт со стаей и учится слышать запах за перевал.</w:t>
       </w:r>
     </w:p>
     <w:p>
@@ -372,36 +487,124 @@
         <w:pStyle w:val="BodyText"/>
       </w:pPr>
       <w:r>
-        <w:t xml:space="preserve">Ведёт её</w:t>
-      </w:r>
-      <w:r>
-        <w:t xml:space="preserve"> </w:t>
-      </w:r>
-      <w:r>
-        <w:rPr>
-          <w:bCs/>
-          <w:b/>
-        </w:rPr>
-        <w:t xml:space="preserve">старая белая волчица</w:t>
-      </w:r>
-      <w:r>
-        <w:t xml:space="preserve"> </w:t>
-      </w:r>
-      <w:r>
-        <w:t xml:space="preserve">со стрелой в боку: аланской стрелой, теми же всадниками, что увезли его сестру. Она умирает. Мальчик сам почти мёртв от холода, и волчица даёт ему</w:t>
-      </w:r>
-      <w:r>
-        <w:t xml:space="preserve"> </w:t>
-      </w:r>
-      <w:r>
-        <w:rPr>
-          <w:bCs/>
-          <w:b/>
-        </w:rPr>
-        <w:t xml:space="preserve">свою кровь</w:t>
-      </w:r>
-      <w:r>
-        <w:t xml:space="preserve">. Вместе с кровью в него уходит она сама.</w:t>
+        <w:rPr>
+          <w:bCs/>
+          <w:b/>
+        </w:rPr>
+        <w:t xml:space="preserve">Весной 451-го</w:t>
+      </w:r>
+      <w:r>
+        <w:t xml:space="preserve"> </w:t>
+      </w:r>
+      <w:r>
+        <w:t xml:space="preserve">в горы приходят беженцы из Армении: при Аваире персы разбили армянское восстание, и пал его вождь</w:t>
+      </w:r>
+      <w:r>
+        <w:t xml:space="preserve"> </w:t>
+      </w:r>
+      <w:r>
+        <w:rPr>
+          <w:bCs/>
+          <w:b/>
+        </w:rPr>
+        <w:t xml:space="preserve">Вардан Мамиконян</w:t>
+      </w:r>
+      <w:r>
+        <w:t xml:space="preserve"> </w:t>
+      </w:r>
+      <w:r>
+        <w:t xml:space="preserve">📜. Среди беглецов девочка лет одиннадцати, дочь Вардана,</w:t>
+      </w:r>
+      <w:r>
+        <w:t xml:space="preserve"> </w:t>
+      </w:r>
+      <w:r>
+        <w:rPr>
+          <w:bCs/>
+          <w:b/>
+        </w:rPr>
+        <w:t xml:space="preserve">Шушаник</w:t>
+      </w:r>
+      <w:r>
+        <w:t xml:space="preserve"> </w:t>
+      </w:r>
+      <w:r>
+        <w:t xml:space="preserve">✳️. Она первая видит одичавшего мальчика среди волков и не пугается. По её рассказу пастухи находят его, а молочный брат Артаваз узнаёт его по крестику.</w:t>
+      </w:r>
+    </w:p>
+    <w:bookmarkEnd w:id="22"/>
+    <w:bookmarkStart w:id="23" w:name="отказ-451455"/>
+    <w:p>
+      <w:pPr>
+        <w:pStyle w:val="Heading2"/>
+      </w:pPr>
+      <w:r>
+        <w:t xml:space="preserve">Отказ (451–455)</w:t>
+      </w:r>
+    </w:p>
+    <w:p>
+      <w:pPr>
+        <w:pStyle w:val="FirstParagraph"/>
+      </w:pPr>
+      <w:r>
+        <w:t xml:space="preserve">Пять лет Вахтанг</w:t>
+      </w:r>
+      <w:r>
+        <w:t xml:space="preserve"> </w:t>
+      </w:r>
+      <w:r>
+        <w:rPr>
+          <w:bCs/>
+          <w:b/>
+        </w:rPr>
+        <w:t xml:space="preserve">прячет волка</w:t>
+      </w:r>
+      <w:r>
+        <w:t xml:space="preserve">.</w:t>
+      </w:r>
+    </w:p>
+    <w:p>
+      <w:pPr>
+        <w:numPr>
+          <w:ilvl w:val="0"/>
+          <w:numId w:val="1004"/>
+        </w:numPr>
+        <w:pStyle w:val="Compact"/>
+      </w:pPr>
+      <w:r>
+        <w:t xml:space="preserve">Мать хранит тайну.</w:t>
+      </w:r>
+    </w:p>
+    <w:p>
+      <w:pPr>
+        <w:numPr>
+          <w:ilvl w:val="0"/>
+          <w:numId w:val="1004"/>
+        </w:numPr>
+        <w:pStyle w:val="Compact"/>
+      </w:pPr>
+      <w:r>
+        <w:t xml:space="preserve">Епископ Микел видит в мальчике беса.</w:t>
+      </w:r>
+    </w:p>
+    <w:p>
+      <w:pPr>
+        <w:numPr>
+          <w:ilvl w:val="0"/>
+          <w:numId w:val="1004"/>
+        </w:numPr>
+        <w:pStyle w:val="Compact"/>
+      </w:pPr>
+      <w:r>
+        <w:t xml:space="preserve">Бинкаран видит в огне, что рядом с тенью мальчика всегда стоит тень волчицы.</w:t>
+      </w:r>
+    </w:p>
+    <w:p>
+      <w:pPr>
+        <w:pStyle w:val="FirstParagraph"/>
+      </w:pPr>
+      <w:r>
+        <w:t xml:space="preserve">Вахтанг хочет быть христианским царём, а не зверем.</w:t>
       </w:r>
     </w:p>
     <w:p>
@@ -409,29 +612,71 @@
         <w:pStyle w:val="BodyText"/>
       </w:pPr>
       <w:r>
-        <w:t xml:space="preserve">Всю зиму Вахтанг живёт со стаей: охотится, спит в куче волчьих тел, учится слышать запах за перевал. Весной горцы-пастухи находят на перевале одичавшего мальчика среди волков. Молочный брат Артаваз узнаёт его по крестику на шее. Стая провожает их до последнего гребня над Мцхетой и остаётся в горах.</w:t>
+        <w:rPr>
+          <w:bCs/>
+          <w:b/>
+        </w:rPr>
+        <w:t xml:space="preserve">В 453 году</w:t>
+      </w:r>
+      <w:r>
+        <w:t xml:space="preserve"> </w:t>
+      </w:r>
+      <w:r>
+        <w:t xml:space="preserve">приходит весть, что умер</w:t>
+      </w:r>
+      <w:r>
+        <w:t xml:space="preserve"> </w:t>
+      </w:r>
+      <w:r>
+        <w:rPr>
+          <w:bCs/>
+          <w:b/>
+        </w:rPr>
+        <w:t xml:space="preserve">Аттила</w:t>
+      </w:r>
+      <w:r>
+        <w:t xml:space="preserve">, «царь царей степи», которого боялись и Рим, и Персия 📜. Через год его держава рассыпается. Осколки гуннской орды откатываются к Кавказу, аланы впервые за восемьдесят лет свободны, и степь за Дарьялом закипает.</w:t>
       </w:r>
     </w:p>
     <w:p>
       <w:pPr>
         <w:pStyle w:val="BodyText"/>
       </w:pPr>
+      <w:r>
+        <w:t xml:space="preserve">При дворе растёт</w:t>
+      </w:r>
+      <w:r>
+        <w:t xml:space="preserve"> </w:t>
+      </w:r>
+      <w:r>
+        <w:rPr>
+          <w:bCs/>
+          <w:b/>
+        </w:rPr>
+        <w:t xml:space="preserve">Варскен</w:t>
+      </w:r>
+      <w:r>
+        <w:t xml:space="preserve">, сын питиахша (наместника) Нижней Картли, ровесник и соперник Вахтанга. Шушаник обещана ему в жёны 📜. Варскен смеётся над «волчонком» и тянется к персам, у которых сила.</w:t>
+      </w:r>
+      <w:r>
+        <w:t xml:space="preserve"> </w:t>
+      </w:r>
       <w:r>
         <w:rPr>
           <w:iCs/>
           <w:i/>
         </w:rPr>
-        <w:t xml:space="preserve">По Кэмпбеллу это «детство героя»: изгнание и воспитание зверем, как у Ромула и Рема. Зов пришёл, но мальчик ответил на него слишком рано и вернулся другим.</w:t>
-      </w:r>
-    </w:p>
-    <w:bookmarkEnd w:id="22"/>
-    <w:bookmarkStart w:id="23" w:name="отказ-1015-лет"/>
+        <w:t xml:space="preserve">Через тридцать лет он отречётся от Христа, замучит Шушаник, и Вахтанг его убьёт 📜. Здесь это только семя.</w:t>
+      </w:r>
+    </w:p>
+    <w:bookmarkEnd w:id="23"/>
+    <w:bookmarkStart w:id="24" w:name="отправление-455-15-лет"/>
     <w:p>
       <w:pPr>
         <w:pStyle w:val="Heading2"/>
       </w:pPr>
       <w:r>
-        <w:t xml:space="preserve">Отказ (10–15 лет)</w:t>
+        <w:t xml:space="preserve">Отправление (~455, 15 лет)</w:t>
       </w:r>
     </w:p>
     <w:p>
@@ -439,56 +684,123 @@
         <w:pStyle w:val="FirstParagraph"/>
       </w:pPr>
       <w:r>
-        <w:t xml:space="preserve">Пять лет Вахтанг</w:t>
-      </w:r>
-      <w:r>
-        <w:t xml:space="preserve"> </w:t>
-      </w:r>
-      <w:r>
-        <w:rPr>
-          <w:bCs/>
-          <w:b/>
-        </w:rPr>
-        <w:t xml:space="preserve">прячет волка</w:t>
-      </w:r>
-      <w:r>
-        <w:t xml:space="preserve">.</w:t>
-      </w:r>
-    </w:p>
-    <w:p>
-      <w:pPr>
-        <w:numPr>
-          <w:ilvl w:val="0"/>
-          <w:numId w:val="1002"/>
-        </w:numPr>
-        <w:pStyle w:val="Compact"/>
-      </w:pPr>
-      <w:r>
-        <w:t xml:space="preserve">Мать хранит тайну.</w:t>
-      </w:r>
-    </w:p>
-    <w:p>
-      <w:pPr>
-        <w:numPr>
-          <w:ilvl w:val="0"/>
-          <w:numId w:val="1002"/>
-        </w:numPr>
-        <w:pStyle w:val="Compact"/>
-      </w:pPr>
-      <w:r>
-        <w:t xml:space="preserve">Епископ Микел видит в мальчике беса и ночами молится над ним.</w:t>
-      </w:r>
-    </w:p>
-    <w:p>
-      <w:pPr>
-        <w:numPr>
-          <w:ilvl w:val="0"/>
-          <w:numId w:val="1002"/>
-        </w:numPr>
-        <w:pStyle w:val="Compact"/>
-      </w:pPr>
-      <w:r>
-        <w:t xml:space="preserve">В Мцхете правит персидский маг Бинкаран, и только его огонь показывает правду: в пламени рядом с тенью мальчика всегда стоит тень волчицы.</w:t>
+        <w:t xml:space="preserve">Совет знати 📜. Вахтанг объявляет поход за сестрой. Спаспет Джуаншер предлагает послать полководца, Вахтанг отвечает, что жалость к сестре пожирает его сердце, как огненный меч. Перед уходом он пишет тайное завещание.</w:t>
+      </w:r>
+    </w:p>
+    <w:p>
+      <w:pPr>
+        <w:pStyle w:val="BodyText"/>
+      </w:pPr>
+      <w:r>
+        <w:t xml:space="preserve">Из Иерусалима приходит монах с письмом от</w:t>
+      </w:r>
+      <w:r>
+        <w:t xml:space="preserve"> </w:t>
+      </w:r>
+      <w:r>
+        <w:rPr>
+          <w:bCs/>
+          <w:b/>
+        </w:rPr>
+        <w:t xml:space="preserve">Петра Ивера</w:t>
+      </w:r>
+      <w:r>
+        <w:t xml:space="preserve"> </w:t>
+      </w:r>
+      <w:r>
+        <w:t xml:space="preserve">📜, грузинского царевича, который ребёнком ушёл заложником в Константинополь и стал монахом. Петр пишет родичу: «Меч вернёт тебе сестру, но не вернёт тебя самого». Это дорога, которую Вахтанг не выбрал: царевич, выбравший крест вместо меча.</w:t>
+      </w:r>
+    </w:p>
+    <w:p>
+      <w:pPr>
+        <w:pStyle w:val="BodyText"/>
+      </w:pPr>
+      <w:r>
+        <w:t xml:space="preserve">В горах стая возвращается к нему. Теперь её ведёт</w:t>
+      </w:r>
+      <w:r>
+        <w:t xml:space="preserve"> </w:t>
+      </w:r>
+      <w:r>
+        <w:rPr>
+          <w:bCs/>
+          <w:b/>
+        </w:rPr>
+        <w:t xml:space="preserve">Тетри</w:t>
+      </w:r>
+      <w:r>
+        <w:t xml:space="preserve">, белая дочь той волчицы. Хевисбери (жрец общины) у святилища Белого Георгия объясняет: дар не проклятие, а знак выбора, но чем чаще Вахтанг отпускает зверя, тем меньше остаётся человека.</w:t>
+      </w:r>
+    </w:p>
+    <w:p>
+      <w:pPr>
+        <w:pStyle w:val="BodyText"/>
+      </w:pPr>
+      <w:r>
+        <w:t xml:space="preserve">Хромой кузнец богов</w:t>
+      </w:r>
+      <w:r>
+        <w:t xml:space="preserve"> </w:t>
+      </w:r>
+      <w:r>
+        <w:rPr>
+          <w:bCs/>
+          <w:b/>
+        </w:rPr>
+        <w:t xml:space="preserve">Шавхани</w:t>
+      </w:r>
+      <w:r>
+        <w:t xml:space="preserve"> </w:t>
+      </w:r>
+      <w:r>
+        <w:t xml:space="preserve">✦ выковывает ему шлем — стальную волчью голову. Это</w:t>
+      </w:r>
+      <w:r>
+        <w:t xml:space="preserve"> </w:t>
+      </w:r>
+      <w:r>
+        <w:rPr>
+          <w:bCs/>
+          <w:b/>
+        </w:rPr>
+        <w:t xml:space="preserve">узда</w:t>
+      </w:r>
+      <w:r>
+        <w:t xml:space="preserve">: в нём можно выпустить волка и вернуться обратно.</w:t>
+      </w:r>
+    </w:p>
+    <w:p>
+      <w:pPr>
+        <w:pStyle w:val="BodyText"/>
+      </w:pPr>
+      <w:r>
+        <w:t xml:space="preserve">На западе в это время</w:t>
+      </w:r>
+      <w:r>
+        <w:t xml:space="preserve"> </w:t>
+      </w:r>
+      <w:r>
+        <w:rPr>
+          <w:bCs/>
+          <w:b/>
+        </w:rPr>
+        <w:t xml:space="preserve">Византия идёт войной на Лазику</w:t>
+      </w:r>
+      <w:r>
+        <w:t xml:space="preserve"> </w:t>
+      </w:r>
+      <w:r>
+        <w:t xml:space="preserve">📜, и греки захватывают земли до Цихегоджи. Знать требует повернуть войско туда. Вахтанг идёт на север.</w:t>
+      </w:r>
+    </w:p>
+    <w:bookmarkEnd w:id="24"/>
+    <w:bookmarkStart w:id="25" w:name="порог-дарьял-456-16-лет"/>
+    <w:p>
+      <w:pPr>
+        <w:pStyle w:val="Heading2"/>
+      </w:pPr>
+      <w:r>
+        <w:t xml:space="preserve">Порог: Дарьял (~456, 16 лет)</w:t>
       </w:r>
     </w:p>
     <w:p>
@@ -496,25 +808,23 @@
         <w:pStyle w:val="FirstParagraph"/>
       </w:pPr>
       <w:r>
-        <w:t xml:space="preserve">Вахтанг хочет быть христианским царём, а не зверем. Волк просыпается в нём от ярости, от крови, от полной луны. После таких ночей во дворце находят разорванных собак, и все делают вид, что ничего не случилось.</w:t>
-      </w:r>
-    </w:p>
-    <w:bookmarkEnd w:id="23"/>
-    <w:bookmarkStart w:id="24" w:name="отправление-15-лет"/>
-    <w:p>
-      <w:pPr>
-        <w:pStyle w:val="Heading2"/>
-      </w:pPr>
-      <w:r>
-        <w:t xml:space="preserve">Отправление (15 лет)</w:t>
-      </w:r>
-    </w:p>
-    <w:p>
-      <w:pPr>
-        <w:pStyle w:val="FirstParagraph"/>
-      </w:pPr>
-      <w:r>
-        <w:t xml:space="preserve">Совет знати. Вахтанг объявляет поход за сестрой. Спаспет Джуаншер предлагает послать полководца. Вахтанг отвечает, что жалость к сестре пожирает его сердце, как огненный меч. Он пишет тайное завещание и уводит войско в горы.</w:t>
+        <w:t xml:space="preserve">Семь дней две армии стоят на берегах реки 📜. С той стороны вольные аланы и</w:t>
+      </w:r>
+      <w:r>
+        <w:t xml:space="preserve"> </w:t>
+      </w:r>
+      <w:r>
+        <w:rPr>
+          <w:bCs/>
+          <w:b/>
+        </w:rPr>
+        <w:t xml:space="preserve">гунны, оставшиеся без хозяина</w:t>
+      </w:r>
+      <w:r>
+        <w:t xml:space="preserve"> </w:t>
+      </w:r>
+      <w:r>
+        <w:t xml:space="preserve">после смерти Аттилы.</w:t>
       </w:r>
     </w:p>
     <w:p>
@@ -522,20 +832,23 @@
         <w:pStyle w:val="BodyText"/>
       </w:pPr>
       <w:r>
-        <w:t xml:space="preserve">В горах стая возвращается к нему. Теперь её ведёт</w:t>
-      </w:r>
-      <w:r>
-        <w:t xml:space="preserve"> </w:t>
-      </w:r>
-      <w:r>
-        <w:rPr>
-          <w:bCs/>
-          <w:b/>
-        </w:rPr>
-        <w:t xml:space="preserve">Тетри</w:t>
-      </w:r>
-      <w:r>
-        <w:t xml:space="preserve">, белая дочь той волчицы.</w:t>
+        <w:t xml:space="preserve">Хазар-великан Тархан разрубает лучшего бойца персов 📜. Вахтанг молится всю ночь и утром убивает великана копьём,</w:t>
+      </w:r>
+      <w:r>
+        <w:t xml:space="preserve"> </w:t>
+      </w:r>
+      <w:r>
+        <w:rPr>
+          <w:bCs/>
+          <w:b/>
+        </w:rPr>
+        <w:t xml:space="preserve">без волка</w:t>
+      </w:r>
+      <w:r>
+        <w:t xml:space="preserve"> </w:t>
+      </w:r>
+      <w:r>
+        <w:t xml:space="preserve">📜. Ему нужно доказать себе, что он царь, а не зверь.</w:t>
       </w:r>
     </w:p>
     <w:p>
@@ -543,7 +856,7 @@
         <w:pStyle w:val="BodyText"/>
       </w:pPr>
       <w:r>
-        <w:t xml:space="preserve">У святилища Белого Георгия хевисбери (жрец общины) говорит ему правду. Волчий дар не проклятие, а знак выбора. Но кровь волчицы требует своё: чем чаще Вахтанг отпускает зверя, тем меньше в нём остаётся человека.</w:t>
+        <w:t xml:space="preserve">Против Бакатара с луком в двенадцать пядей 📜 человеческой силы не хватает. Вахтанг отпускает волка. Он видит летящую стрелу издалека и уходит от неё 📜, третья стрела убивает его коня, и он прыгает на великана в падении 📜.</w:t>
       </w:r>
     </w:p>
     <w:p>
@@ -551,33 +864,7 @@
         <w:pStyle w:val="BodyText"/>
       </w:pPr>
       <w:r>
-        <w:t xml:space="preserve">Горный бог Копала посылает его к хромому кузнецу Шавхани. Шавхани выковывает</w:t>
-      </w:r>
-      <w:r>
-        <w:t xml:space="preserve"> </w:t>
-      </w:r>
-      <w:r>
-        <w:rPr>
-          <w:bCs/>
-          <w:b/>
-        </w:rPr>
-        <w:t xml:space="preserve">шлем — стальную волчью голову</w:t>
-      </w:r>
-      <w:r>
-        <w:t xml:space="preserve">. Это не оружие, а</w:t>
-      </w:r>
-      <w:r>
-        <w:t xml:space="preserve"> </w:t>
-      </w:r>
-      <w:r>
-        <w:rPr>
-          <w:bCs/>
-          <w:b/>
-        </w:rPr>
-        <w:t xml:space="preserve">узда</w:t>
-      </w:r>
-      <w:r>
-        <w:t xml:space="preserve">. В шлеме Вахтанг может выпустить волка и вернуться обратно. Без шлема когда-нибудь не вернётся.</w:t>
+        <w:t xml:space="preserve">Бакатар видит стаю на гребне и янтарный глаз. «Тутыр выбрал тебя», — говорит он: так аланы зовут хозяина волков. Потом он рассказывает правду. Аланы платят невидимым деви дань за проход через Дарьял, и шесть лет назад этой данью стала Мирандухт. Бакатар сам отвёз её под гору. Выбор: убить его или пощадить и потерять войско.</w:t>
       </w:r>
     </w:p>
     <w:p>
@@ -585,23 +872,30 @@
         <w:pStyle w:val="BodyText"/>
       </w:pPr>
       <w:r>
-        <w:t xml:space="preserve">Здесь у Вахтанга появляется имя, которое дадут ему персы:</w:t>
-      </w:r>
-      <w:r>
-        <w:t xml:space="preserve"> </w:t>
-      </w:r>
-      <w:r>
-        <w:rPr>
-          <w:bCs/>
-          <w:b/>
-        </w:rPr>
-        <w:t xml:space="preserve">Горгасали, «волчья голова»</w:t>
-      </w:r>
-      <w:r>
-        <w:t xml:space="preserve"> </w:t>
-      </w:r>
-      <w:r>
-        <w:t xml:space="preserve">📜.</w:t>
+        <w:rPr>
+          <w:bCs/>
+          <w:b/>
+        </w:rPr>
+        <w:t xml:space="preserve">Новый союзник.</w:t>
+      </w:r>
+      <w:r>
+        <w:t xml:space="preserve"> </w:t>
+      </w:r>
+      <w:r>
+        <w:t xml:space="preserve">В плен попадает</w:t>
+      </w:r>
+      <w:r>
+        <w:t xml:space="preserve"> </w:t>
+      </w:r>
+      <w:r>
+        <w:rPr>
+          <w:bCs/>
+          <w:b/>
+        </w:rPr>
+        <w:t xml:space="preserve">старый гунн</w:t>
+      </w:r>
+      <w:r>
+        <w:t xml:space="preserve">, которого все зовут Одноухим ✳️. Он был при ставке Аттилы и видел, как тот принимал римских послов. Одноухий знает ходы за Дарьялом, потому что гунны прошли этими перевалами на Персию ещё до его рождения 📜. Он соглашается вести Вахтанга вниз. Его рассказы у костра — главное зеркало героя: «Аттила тоже был волком. Его боялись все, а любил кто? Умер — и через год от его царства не осталось ничего».</w:t>
       </w:r>
     </w:p>
     <w:p>
@@ -609,110 +903,7 @@
         <w:pStyle w:val="BodyText"/>
       </w:pPr>
       <w:r>
-        <w:t xml:space="preserve">Контракты в горах учат его, что у каждого существа есть правило. Своё правило теперь есть и у него самого: кудиани знает, как</w:t>
-      </w:r>
-      <w:r>
-        <w:t xml:space="preserve"> </w:t>
-      </w:r>
-      <w:r>
-        <w:rPr>
-          <w:bCs/>
-          <w:b/>
-        </w:rPr>
-        <w:t xml:space="preserve">«замкнуть волчью пасть»</w:t>
-      </w:r>
-      <w:r>
-        <w:t xml:space="preserve"> </w:t>
-      </w:r>
-      <w:r>
-        <w:t xml:space="preserve">✳️, и однажды обрывает его связь со стаей посреди боя.</w:t>
-      </w:r>
-    </w:p>
-    <w:bookmarkEnd w:id="24"/>
-    <w:bookmarkStart w:id="25" w:name="порог-дарьял-16-лет"/>
-    <w:p>
-      <w:pPr>
-        <w:pStyle w:val="Heading2"/>
-      </w:pPr>
-      <w:r>
-        <w:t xml:space="preserve">Порог: Дарьял (16 лет)</w:t>
-      </w:r>
-    </w:p>
-    <w:p>
-      <w:pPr>
-        <w:pStyle w:val="FirstParagraph"/>
-      </w:pPr>
-      <w:r>
-        <w:t xml:space="preserve">Семь дней две армии стоят на берегах реки 📜.</w:t>
-      </w:r>
-    </w:p>
-    <w:p>
-      <w:pPr>
-        <w:pStyle w:val="BodyText"/>
-      </w:pPr>
-      <w:r>
-        <w:t xml:space="preserve">Хазар-великан Тархан разрубает лучшего бойца персов. Вахтанг всю ночь молится и утром убивает великана копьём,</w:t>
-      </w:r>
-      <w:r>
-        <w:t xml:space="preserve"> </w:t>
-      </w:r>
-      <w:r>
-        <w:rPr>
-          <w:bCs/>
-          <w:b/>
-        </w:rPr>
-        <w:t xml:space="preserve">без волка</w:t>
-      </w:r>
-      <w:r>
-        <w:t xml:space="preserve">. Ему важно доказать себе, что он царь, а не зверь.</w:t>
-      </w:r>
-    </w:p>
-    <w:p>
-      <w:pPr>
-        <w:pStyle w:val="BodyText"/>
-      </w:pPr>
-      <w:r>
-        <w:t xml:space="preserve">Против Бакатара с луком в двенадцать пядей человеческой силы не хватает. Вахтанг отпускает волка.</w:t>
-      </w:r>
-      <w:r>
-        <w:t xml:space="preserve"> </w:t>
-      </w:r>
-      <w:r>
-        <w:rPr>
-          <w:bCs/>
-          <w:b/>
-        </w:rPr>
-        <w:t xml:space="preserve">Он видит летящую стрелу издалека и уходит от неё</w:t>
-      </w:r>
-      <w:r>
-        <w:t xml:space="preserve"> </w:t>
-      </w:r>
-      <w:r>
-        <w:t xml:space="preserve">📜, уклоняется от второй, третья убивает коня. Он прыгает на великана в падении 📜.</w:t>
-      </w:r>
-    </w:p>
-    <w:p>
-      <w:pPr>
-        <w:pStyle w:val="BodyText"/>
-      </w:pPr>
-      <w:r>
-        <w:t xml:space="preserve">В схватке Бакатар видит стаю на гребне и янтарный глаз. «Тутыр выбрал тебя», — говорит он. Потом рассказывает правду: аланы платят дань невидимым деви за проход через Дарьял, и шесть лет назад этой данью стала Мирандухт. Он сам отвёз её под гору.</w:t>
-      </w:r>
-    </w:p>
-    <w:p>
-      <w:pPr>
-        <w:pStyle w:val="BodyText"/>
-      </w:pPr>
-      <w:r>
-        <w:t xml:space="preserve">Выбор: убить его, как требуют честь и армия, или пощадить и потерять войско.</w:t>
-      </w:r>
-    </w:p>
-    <w:p>
-      <w:pPr>
-        <w:pStyle w:val="BodyText"/>
-      </w:pPr>
-      <w:r>
-        <w:t xml:space="preserve">После поединка Вахтанг уходит за Дарьял, в нижний мир. Армия считает его мёртвым. В Мцхете вскрывают завещание.</w:t>
+        <w:t xml:space="preserve">Вахтанг уходит за Дарьял, в нижний мир. Армия считает его мёртвым. В Мцхете вскрывают завещание 📜.</w:t>
       </w:r>
     </w:p>
     <w:bookmarkEnd w:id="25"/>
@@ -730,39 +921,23 @@
         <w:pStyle w:val="FirstParagraph"/>
       </w:pPr>
       <w:r>
-        <w:t xml:space="preserve">Квесквнели, страна мёртвых и деви. Здесь шлем приходится снимать: только</w:t>
-      </w:r>
-      <w:r>
-        <w:t xml:space="preserve"> </w:t>
-      </w:r>
-      <w:r>
-        <w:rPr>
-          <w:bCs/>
-          <w:b/>
-        </w:rPr>
-        <w:t xml:space="preserve">волчье чутьё</w:t>
-      </w:r>
-      <w:r>
-        <w:t xml:space="preserve"> </w:t>
-      </w:r>
-      <w:r>
-        <w:t xml:space="preserve">ведёт по тропам, где у людей нет дорог.</w:t>
+        <w:t xml:space="preserve">Квесквнели, страна мёртвых и деви ✦. Здесь шлем приходится снимать: только волчье чутьё ведёт по тропам, где у людей нет дорог.</w:t>
       </w:r>
     </w:p>
     <w:p>
       <w:pPr>
         <w:numPr>
           <w:ilvl w:val="0"/>
-          <w:numId w:val="1003"/>
-        </w:numPr>
-        <w:pStyle w:val="Compact"/>
-      </w:pPr>
-      <w:r>
-        <w:rPr>
-          <w:bCs/>
-          <w:b/>
-        </w:rPr>
-        <w:t xml:space="preserve">Тетри и стая видят деви</w:t>
+          <w:numId w:val="1005"/>
+        </w:numPr>
+        <w:pStyle w:val="Compact"/>
+      </w:pPr>
+      <w:r>
+        <w:rPr>
+          <w:bCs/>
+          <w:b/>
+        </w:rPr>
+        <w:t xml:space="preserve">Стая видит деви</w:t>
       </w:r>
       <w:r>
         <w:t xml:space="preserve">, которых не видит человек. Волки рычат на пустой воздух, и Вахтанг бьёт туда.</w:t>
@@ -772,32 +947,29 @@
       <w:pPr>
         <w:numPr>
           <w:ilvl w:val="0"/>
-          <w:numId w:val="1003"/>
-        </w:numPr>
-        <w:pStyle w:val="Compact"/>
-      </w:pPr>
-      <w:r>
-        <w:t xml:space="preserve">Под Казбеком, где из глубины звенят цепи Амирани, к нему приходит</w:t>
-      </w:r>
-      <w:r>
-        <w:t xml:space="preserve"> </w:t>
-      </w:r>
-      <w:r>
-        <w:rPr>
-          <w:bCs/>
-          <w:b/>
-        </w:rPr>
-        <w:t xml:space="preserve">богиня охоты Дали</w:t>
-      </w:r>
-      <w:r>
-        <w:t xml:space="preserve">, мать Амирани. Она даёт удачу охотника при условии тайны.</w:t>
+          <w:numId w:val="1005"/>
+        </w:numPr>
+        <w:pStyle w:val="Compact"/>
+      </w:pPr>
+      <w:r>
+        <w:rPr>
+          <w:bCs/>
+          <w:b/>
+        </w:rPr>
+        <w:t xml:space="preserve">Дали</w:t>
+      </w:r>
+      <w:r>
+        <w:t xml:space="preserve"> </w:t>
+      </w:r>
+      <w:r>
+        <w:t xml:space="preserve">✦, мать Амирани, приходит к нему под Казбеком. Из глубины звенят цепи её сына. Она даёт удачу охотника при условии тайны.</w:t>
       </w:r>
     </w:p>
     <w:p>
       <w:pPr>
         <w:numPr>
           <w:ilvl w:val="0"/>
-          <w:numId w:val="1003"/>
+          <w:numId w:val="1005"/>
         </w:numPr>
         <w:pStyle w:val="Compact"/>
       </w:pPr>
@@ -812,49 +984,58 @@
         <w:t xml:space="preserve"> </w:t>
       </w:r>
       <w:r>
-        <w:t xml:space="preserve">открывает правду о роде Нимрода. Часть исполинов пала вниз и стала деви. Вахтанг одной крови с теми, кто держит его сестру.</w:t>
-      </w:r>
-      <w:r>
-        <w:t xml:space="preserve"> </w:t>
-      </w:r>
-      <w:r>
-        <w:rPr>
-          <w:bCs/>
-          <w:b/>
-        </w:rPr>
-        <w:t xml:space="preserve">В нём две нечеловеческие крови: исполинская и волчья.</w:t>
+        <w:t xml:space="preserve">открывает правду о роде Нимрода 📜✦: часть исполинов пала вниз и стала деви. В Вахтанге две нечеловеческие крови, исполинская и волчья.</w:t>
       </w:r>
     </w:p>
     <w:p>
       <w:pPr>
         <w:numPr>
           <w:ilvl w:val="0"/>
-          <w:numId w:val="1003"/>
-        </w:numPr>
-        <w:pStyle w:val="Compact"/>
-      </w:pPr>
-      <w:r>
-        <w:t xml:space="preserve">Мирандухт растит</w:t>
-      </w:r>
-      <w:r>
-        <w:t xml:space="preserve"> </w:t>
-      </w:r>
-      <w:r>
-        <w:rPr>
-          <w:bCs/>
-          <w:b/>
-        </w:rPr>
-        <w:t xml:space="preserve">мать деви</w:t>
-      </w:r>
-      <w:r>
-        <w:t xml:space="preserve">. Девочка зовёт её «нана» и брата не помнит. Мать деви предлагает ему остаться: «Ты уже наполовину зверь. Здесь никто не заставит тебя прятаться».</w:t>
+          <w:numId w:val="1005"/>
+        </w:numPr>
+        <w:pStyle w:val="Compact"/>
+      </w:pPr>
+      <w:r>
+        <w:rPr>
+          <w:bCs/>
+          <w:b/>
+        </w:rPr>
+        <w:t xml:space="preserve">Мирандухт растит мать деви</w:t>
+      </w:r>
+      <w:r>
+        <w:t xml:space="preserve"> </w:t>
+      </w:r>
+      <w:r>
+        <w:t xml:space="preserve">✦. Девочка зовёт её «нана» и брата не помнит. Мать деви предлагает Вахтангу остаться: «Ты уже наполовину зверь».</w:t>
       </w:r>
     </w:p>
     <w:p>
       <w:pPr>
         <w:numPr>
           <w:ilvl w:val="0"/>
-          <w:numId w:val="1003"/>
+          <w:numId w:val="1005"/>
+        </w:numPr>
+        <w:pStyle w:val="Compact"/>
+      </w:pPr>
+      <w:r>
+        <w:rPr>
+          <w:bCs/>
+          <w:b/>
+        </w:rPr>
+        <w:t xml:space="preserve">Одноухий</w:t>
+      </w:r>
+      <w:r>
+        <w:t xml:space="preserve"> </w:t>
+      </w:r>
+      <w:r>
+        <w:t xml:space="preserve">тоже делает выбор: гунн, у которого нет ни царя, ни дома, остаётся внизу, где его никто не спросит, кому он служит. Или жертвует собой ради мальчика, который напомнил ему, каким Аттила мог бы быть. Это решает игрок.</w:t>
+      </w:r>
+    </w:p>
+    <w:p>
+      <w:pPr>
+        <w:numPr>
+          <w:ilvl w:val="0"/>
+          <w:numId w:val="1005"/>
         </w:numPr>
         <w:pStyle w:val="Compact"/>
       </w:pPr>
@@ -869,42 +1050,39 @@
         <w:t xml:space="preserve"> </w:t>
       </w:r>
       <w:r>
-        <w:t xml:space="preserve">Вахтанг впервые обращается в волка</w:t>
-      </w:r>
-      <w:r>
-        <w:t xml:space="preserve"> </w:t>
-      </w:r>
-      <w:r>
-        <w:rPr>
-          <w:bCs/>
-          <w:b/>
-        </w:rPr>
-        <w:t xml:space="preserve">полностью</w:t>
-      </w:r>
-      <w:r>
-        <w:t xml:space="preserve">, огромного серого волка размером с коня. В этом облике он видит оба мира сразу и понимает, что мир один. Самое трудное — вернуться в человеческий облик. Его вытаскивает из волка запах крестика сестры.</w:t>
+        <w:t xml:space="preserve">Вахтанг впервые обращается в волка полностью. Он видит оба мира сразу и понимает, что мир один. Вернуться в человека ему помогает запах крестика сестры.</w:t>
       </w:r>
     </w:p>
     <w:p>
       <w:pPr>
         <w:numPr>
           <w:ilvl w:val="0"/>
-          <w:numId w:val="1003"/>
-        </w:numPr>
-        <w:pStyle w:val="Compact"/>
-      </w:pPr>
-      <w:r>
-        <w:t xml:space="preserve">Поединок с однорогим Цалркой, старшим из семи братьев-деви. Человек и волк против исполина.</w:t>
+          <w:numId w:val="1005"/>
+        </w:numPr>
+        <w:pStyle w:val="Compact"/>
+      </w:pPr>
+      <w:r>
+        <w:rPr>
+          <w:bCs/>
+          <w:b/>
+        </w:rPr>
+        <w:t xml:space="preserve">Поединок с Цалркой</w:t>
+      </w:r>
+      <w:r>
+        <w:t xml:space="preserve"> </w:t>
+      </w:r>
+      <w:r>
+        <w:t xml:space="preserve">✦, однорогим старшим из семи братьев-деви.</w:t>
       </w:r>
     </w:p>
     <w:bookmarkEnd w:id="26"/>
-    <w:bookmarkStart w:id="27" w:name="возвращение"/>
+    <w:bookmarkStart w:id="27" w:name="возвращение-456462-1622-года"/>
     <w:p>
       <w:pPr>
         <w:pStyle w:val="Heading2"/>
       </w:pPr>
       <w:r>
-        <w:t xml:space="preserve">Возвращение</w:t>
+        <w:t xml:space="preserve">Возвращение (456–462, 16–22 года)</w:t>
       </w:r>
     </w:p>
     <w:p>
@@ -912,7 +1090,7 @@
         <w:pStyle w:val="FirstParagraph"/>
       </w:pPr>
       <w:r>
-        <w:t xml:space="preserve">Сестра не хочет уходить. За ними гонятся братья-деви. Из нижнего мира их выносит птица Пасканджи, и Вахтанг кормит её собственной плотью.</w:t>
+        <w:t xml:space="preserve">Сестра не хочет уходить. За ними гонятся братья-деви. Из нижнего мира их выносит птица Пасканджи ✦, и Вахтанг кормит её собственной плотью.</w:t>
       </w:r>
     </w:p>
     <w:p>
@@ -920,7 +1098,7 @@
         <w:pStyle w:val="BodyText"/>
       </w:pPr>
       <w:r>
-        <w:t xml:space="preserve">У выхода ждут Артаваз и стая. Бакатар тоже приходит, но только если его пощадили.</w:t>
+        <w:t xml:space="preserve">У выхода ждут Артаваз и стая, а если Вахтанг пощадил Бакатара, то и Бакатар.</w:t>
       </w:r>
     </w:p>
     <w:p>
@@ -928,20 +1106,7 @@
         <w:pStyle w:val="BodyText"/>
       </w:pPr>
       <w:r>
-        <w:t xml:space="preserve">Мост Шавхани над пропастью: человек проходит, деви падает. Решается, пройдёт ли сестра и</w:t>
-      </w:r>
-      <w:r>
-        <w:t xml:space="preserve"> </w:t>
-      </w:r>
-      <w:r>
-        <w:rPr>
-          <w:bCs/>
-          <w:b/>
-        </w:rPr>
-        <w:t xml:space="preserve">пройдёт ли сам Вахтанг</w:t>
-      </w:r>
-      <w:r>
-        <w:t xml:space="preserve">, если слишком много раз отпускал волка. (Это последствия всей игры.)</w:t>
+        <w:t xml:space="preserve">Мост Шавхани над пропастью: человек проходит, деви падает ✦. Решается, пройдёт ли сестра и пройдёт ли сам Вахтанг, если слишком часто отпускал волка.</w:t>
       </w:r>
     </w:p>
     <w:p>
@@ -949,7 +1114,7 @@
         <w:pStyle w:val="BodyText"/>
       </w:pPr>
       <w:r>
-        <w:t xml:space="preserve">Аланы требуют тридцать тысяч пленных 📜, и он платит. Он возвращается в Мцхету, где его уже похоронили. Люди стелют одежду ему под ноги 📜.</w:t>
+        <w:t xml:space="preserve">Аланы требуют тридцать тысяч пленных 📜, Вахтанг платит. Он возвращается в Мцхету, где его уже похоронили, и люди стелют одежду ему под ноги 📜.</w:t>
       </w:r>
     </w:p>
     <w:p>
@@ -957,7 +1122,7 @@
         <w:pStyle w:val="BodyText"/>
       </w:pPr>
       <w:r>
-        <w:t xml:space="preserve">Вахтанг ставит башни у Дарьяла и запирает дверь в нижний мир. Он собирает Картли: в каждой области два хозяина, эристав и невидимый, и договориться нужно с обоими. Горцы идут за ним охотнее, чем за любым царём до него. Они видят волков и знают, чей это знак.</w:t>
+        <w:t xml:space="preserve">Вахтанг ставит башни у Дарьяла 📜 и запирает дверь в нижний мир. Потом собирает Картли: в каждой области два хозяина, эристав и невидимый, и договориться нужно с обоими. Горцы идут за «волчьим царём» охотнее, чем за любым царём до него.</w:t>
       </w:r>
     </w:p>
     <w:p>
@@ -965,17 +1130,45 @@
         <w:pStyle w:val="BodyText"/>
       </w:pPr>
       <w:r>
-        <w:t xml:space="preserve">Беркут бьёт фазана, обе птицы падают в горячий источник. Там Вахтанг закладывает Тбилиси, город двух миров.</w:t>
+        <w:rPr>
+          <w:bCs/>
+          <w:b/>
+        </w:rPr>
+        <w:t xml:space="preserve">Свадьба Варскена и Шушаник.</w:t>
+      </w:r>
+      <w:r>
+        <w:t xml:space="preserve"> </w:t>
+      </w:r>
+      <w:r>
+        <w:t xml:space="preserve">Вахтанг на ней почётный гость, и Варскен поднимает тост «за волка, который вернулся». Шушаник смотрит на обоих и понимает больше, чем они.</w:t>
+      </w:r>
+    </w:p>
+    <w:p>
+      <w:pPr>
+        <w:pStyle w:val="BodyText"/>
+      </w:pPr>
+      <w:r>
+        <w:rPr>
+          <w:bCs/>
+          <w:b/>
+        </w:rPr>
+        <w:t xml:space="preserve">458 год</w:t>
+      </w:r>
+      <w:r>
+        <w:t xml:space="preserve"> </w:t>
+      </w:r>
+      <w:r>
+        <w:t xml:space="preserve">📜. Беркут бьёт фазана, обе птицы падают в горячий источник. Там Вахтанг закладывает Тбилиси, город двух миров.</w:t>
       </w:r>
     </w:p>
     <w:bookmarkEnd w:id="27"/>
-    <w:bookmarkStart w:id="28" w:name="эпилог"/>
+    <w:bookmarkStart w:id="28" w:name="эпилог-462"/>
     <w:p>
       <w:pPr>
         <w:pStyle w:val="Heading2"/>
       </w:pPr>
       <w:r>
-        <w:t xml:space="preserve">Эпилог</w:t>
+        <w:t xml:space="preserve">Эпилог (~462)</w:t>
       </w:r>
     </w:p>
     <w:p>
@@ -983,7 +1176,7 @@
         <w:pStyle w:val="FirstParagraph"/>
       </w:pPr>
       <w:r>
-        <w:t xml:space="preserve">Посол шаха просит руки Мирандухт. Уходя, он шепчет: «Dur az Gorgasal» — «берегитесь волчьей головы». Ночью над новым городом воет стая, и в глазах сестры на миг мелькает что-то нечеловеческое.</w:t>
+        <w:t xml:space="preserve">Посол шаха просит руки Мирандухт 📜. Уходя, он шепчет: «Dur az Gorgasal» — «берегитесь волчьей головы». Ночью над новым городом воет стая, а в глазах сестры на миг мелькает что-то нечеловеческое.</w:t>
       </w:r>
     </w:p>
     <w:p>
@@ -992,29 +1185,202 @@
       </w:pPr>
       <w:r>
         <w:rPr>
-          <w:iCs/>
-          <w:i/>
-        </w:rPr>
-        <w:t xml:space="preserve">Крючок для второй игры:</w:t>
-      </w:r>
-      <w:r>
-        <w:t xml:space="preserve"> </w:t>
-      </w:r>
-      <w:r>
-        <w:t xml:space="preserve">по хронике епископ Микел однажды ударит царя ногой в лицо и выбьет ему зуб 📜. У нас это будет</w:t>
-      </w:r>
-      <w:r>
-        <w:t xml:space="preserve"> </w:t>
-      </w:r>
-      <w:r>
-        <w:rPr>
-          <w:bCs/>
-          <w:b/>
-        </w:rPr>
-        <w:t xml:space="preserve">волчий клык</w:t>
-      </w:r>
-      <w:r>
-        <w:t xml:space="preserve">.</w:t>
+          <w:bCs/>
+          <w:b/>
+        </w:rPr>
+        <w:t xml:space="preserve">Крючки на вторую игру (470–480-е):</w:t>
+      </w:r>
+    </w:p>
+    <w:p>
+      <w:pPr>
+        <w:numPr>
+          <w:ilvl w:val="0"/>
+          <w:numId w:val="1006"/>
+        </w:numPr>
+        <w:pStyle w:val="Compact"/>
+      </w:pPr>
+      <w:r>
+        <w:t xml:space="preserve">Варскен перейдёт к персам и замучит Шушаник. Мученичество Шушаник — древнейший памятник грузинской литературы 📜.</w:t>
+      </w:r>
+    </w:p>
+    <w:p>
+      <w:pPr>
+        <w:numPr>
+          <w:ilvl w:val="0"/>
+          <w:numId w:val="1006"/>
+        </w:numPr>
+        <w:pStyle w:val="Compact"/>
+      </w:pPr>
+      <w:r>
+        <w:t xml:space="preserve">Вахтанг убьёт Варскена около 482 года, и это начнёт его восстание против Персии вместе с армянином</w:t>
+      </w:r>
+      <w:r>
+        <w:t xml:space="preserve"> </w:t>
+      </w:r>
+      <w:r>
+        <w:rPr>
+          <w:bCs/>
+          <w:b/>
+        </w:rPr>
+        <w:t xml:space="preserve">Ваганом Мамиконяном</w:t>
+      </w:r>
+      <w:r>
+        <w:t xml:space="preserve"> </w:t>
+      </w:r>
+      <w:r>
+        <w:t xml:space="preserve">📜.</w:t>
+      </w:r>
+    </w:p>
+    <w:p>
+      <w:pPr>
+        <w:numPr>
+          <w:ilvl w:val="0"/>
+          <w:numId w:val="1006"/>
+        </w:numPr>
+        <w:pStyle w:val="Compact"/>
+      </w:pPr>
+      <w:r>
+        <w:t xml:space="preserve">Епископ Микел выбьет царю зуб 📜. У нас это будет волчий клык.</w:t>
+      </w:r>
+    </w:p>
+    <w:p>
+      <w:r>
+        <w:pict>
+          <v:rect style="width:0;height:1.5pt" o:hralign="center" o:hrstd="t" o:hr="t"/>
+        </w:pict>
+      </w:r>
+    </w:p>
+    <w:p>
+      <w:pPr>
+        <w:pStyle w:val="FirstParagraph"/>
+      </w:pPr>
+      <w:r>
+        <w:rPr>
+          <w:bCs/>
+          <w:b/>
+        </w:rPr>
+        <w:t xml:space="preserve">Тема.</w:t>
+      </w:r>
+      <w:r>
+        <w:t xml:space="preserve"> </w:t>
+      </w:r>
+      <w:r>
+        <w:t xml:space="preserve">Царь — не стена между мирами, а дверь, и держит он её собственной плотью. Аттила — образ царя-волка, которого только боялись, и Вахтанг рискует стать таким же. Петр Ивер — образ царевича, который отказался от меча. Вахтанг ищет третий путь.</w:t>
+      </w:r>
+    </w:p>
+    <w:p>
+      <w:r>
+        <w:pict>
+          <v:rect style="width:0;height:1.5pt" o:hralign="center" o:hrstd="t" o:hr="t"/>
+        </w:pict>
+      </w:r>
+    </w:p>
+    <w:p>
+      <w:pPr>
+        <w:pStyle w:val="FirstParagraph"/>
+      </w:pPr>
+      <w:r>
+        <w:rPr>
+          <w:bCs/>
+          <w:b/>
+        </w:rPr>
+        <w:t xml:space="preserve">Историческая сверка.</w:t>
+      </w:r>
+    </w:p>
+    <w:p>
+      <w:pPr>
+        <w:numPr>
+          <w:ilvl w:val="0"/>
+          <w:numId w:val="1007"/>
+        </w:numPr>
+        <w:pStyle w:val="Compact"/>
+      </w:pPr>
+      <w:r>
+        <w:t xml:space="preserve">Даты приблизительные: Вахтанг родился около 440 года.</w:t>
+      </w:r>
+    </w:p>
+    <w:p>
+      <w:pPr>
+        <w:numPr>
+          <w:ilvl w:val="0"/>
+          <w:numId w:val="1007"/>
+        </w:numPr>
+        <w:pStyle w:val="Compact"/>
+      </w:pPr>
+      <w:r>
+        <w:t xml:space="preserve">Исторические факты: Аваир (451), смерть Аттилы (453), основание Тбилиси по хроникам (458), Шушаник и Варскен, Петр Ивер.</w:t>
+      </w:r>
+    </w:p>
+    <w:p>
+      <w:pPr>
+        <w:numPr>
+          <w:ilvl w:val="0"/>
+          <w:numId w:val="1007"/>
+        </w:numPr>
+        <w:pStyle w:val="Compact"/>
+      </w:pPr>
+      <w:r>
+        <w:t xml:space="preserve">Наши допущения ✳️:</w:t>
+      </w:r>
+    </w:p>
+    <w:p>
+      <w:pPr>
+        <w:numPr>
+          <w:ilvl w:val="1"/>
+          <w:numId w:val="1008"/>
+        </w:numPr>
+        <w:pStyle w:val="Compact"/>
+      </w:pPr>
+      <w:r>
+        <w:t xml:space="preserve">встреча Шушаник с Вахтангом в детстве;</w:t>
+      </w:r>
+    </w:p>
+    <w:p>
+      <w:pPr>
+        <w:numPr>
+          <w:ilvl w:val="1"/>
+          <w:numId w:val="1008"/>
+        </w:numPr>
+        <w:pStyle w:val="Compact"/>
+      </w:pPr>
+      <w:r>
+        <w:t xml:space="preserve">письмо Петра;</w:t>
+      </w:r>
+    </w:p>
+    <w:p>
+      <w:pPr>
+        <w:numPr>
+          <w:ilvl w:val="1"/>
+          <w:numId w:val="1008"/>
+        </w:numPr>
+        <w:pStyle w:val="Compact"/>
+      </w:pPr>
+      <w:r>
+        <w:t xml:space="preserve">Одноухий;</w:t>
+      </w:r>
+    </w:p>
+    <w:p>
+      <w:pPr>
+        <w:numPr>
+          <w:ilvl w:val="1"/>
+          <w:numId w:val="1008"/>
+        </w:numPr>
+        <w:pStyle w:val="Compact"/>
+      </w:pPr>
+      <w:r>
+        <w:t xml:space="preserve">что Шушаник обещана Варскену именно в эти годы. Её брак — исторический факт, но точная дата свадьбы неизвестна.</w:t>
+      </w:r>
+    </w:p>
+    <w:p>
+      <w:pPr>
+        <w:numPr>
+          <w:ilvl w:val="0"/>
+          <w:numId w:val="1007"/>
+        </w:numPr>
+        <w:pStyle w:val="Compact"/>
+      </w:pPr>
+      <w:r>
+        <w:t xml:space="preserve">Нужна сверка с источниками.</w:t>
       </w:r>
     </w:p>
     <w:p>
@@ -1635,7 +2001,7 @@
       <w:pPr>
         <w:numPr>
           <w:ilvl w:val="0"/>
-          <w:numId w:val="1004"/>
+          <w:numId w:val="1009"/>
         </w:numPr>
         <w:pStyle w:val="Compact"/>
       </w:pPr>
@@ -1657,7 +2023,7 @@
       <w:pPr>
         <w:numPr>
           <w:ilvl w:val="0"/>
-          <w:numId w:val="1004"/>
+          <w:numId w:val="1009"/>
         </w:numPr>
         <w:pStyle w:val="Compact"/>
       </w:pPr>
@@ -1679,7 +2045,7 @@
       <w:pPr>
         <w:numPr>
           <w:ilvl w:val="0"/>
-          <w:numId w:val="1004"/>
+          <w:numId w:val="1009"/>
         </w:numPr>
         <w:pStyle w:val="Compact"/>
       </w:pPr>
@@ -1701,7 +2067,7 @@
       <w:pPr>
         <w:numPr>
           <w:ilvl w:val="0"/>
-          <w:numId w:val="1004"/>
+          <w:numId w:val="1009"/>
         </w:numPr>
         <w:pStyle w:val="Compact"/>
       </w:pPr>
@@ -2058,6 +2424,21 @@
     <w:abstractNumId w:val="991"/>
   </w:num>
   <w:num w:numId="1004">
+    <w:abstractNumId w:val="991"/>
+  </w:num>
+  <w:num w:numId="1005">
+    <w:abstractNumId w:val="991"/>
+  </w:num>
+  <w:num w:numId="1006">
+    <w:abstractNumId w:val="991"/>
+  </w:num>
+  <w:num w:numId="1007">
+    <w:abstractNumId w:val="991"/>
+  </w:num>
+  <w:num w:numId="1008">
+    <w:abstractNumId w:val="991"/>
+  </w:num>
+  <w:num w:numId="1009">
     <w:abstractNumId w:val="991"/>
   </w:num>
 </w:numbering>

</xml_diff>